<commit_message>
Finalize Blog 1: reconcile claims with live site, strip AI fingerprints
Final copy for the white-label partnerships piece. Reconciled every
claim against live trillet.ai: corrected compliance to SOC 2 Type II +
ISO 27001 (HIPAA/GDPR/ACMA/TCPA), removed the unverified 'included on
every plan at no cost' claim, sharpened the verified audit-trail claim
(full audit trails + role-based access per client workspace, recordings
and transcripts onshore), fixed the partner structure (self-serve
white-label platform vs the three reseller/referral/OEM tracks), and
used the real /bin/bash.12/min usage figure. Removed author-note scaffolding,
eliminated all em-dashes, and cut AI tics (dramatic fragments, empty
punchy lines, negation beats). Added six inline internal links. Added a
'reconciled with live site' summary and a re-confirm-at-publish flag.

Co-Authored-By: Claude Opus 4.8 <noreply@anthropic.com>
Claude-Session: https://claude.ai/code/session_01UhVChLeNNjFDr6eASTMGhh
</commit_message>
<xml_diff>
--- a/seo-audit/Article-01-White-Label-Partnerships-Guide.docx
+++ b/seo-audit/Article-01-White-Label-Partnerships-Guide.docx
@@ -16,7 +16,7 @@
           <w:sz w:val="15"/>
           <w:szCs w:val="15"/>
         </w:rPr>
-        <w:t xml:space="preserve">TRILLET · ARTICLE DRAFT V2 · BLOG 1 OF 6</w:t>
+        <w:t xml:space="preserve">TRILLET · FINAL COPY · BLOG 1 OF 6</w:t>
       </w:r>
     </w:p>
     <w:p>
@@ -29,8 +29,8 @@
           <w:b/>
           <w:bCs/>
           <w:color w:val="16223C"/>
-          <w:sz w:val="38"/>
-          <w:szCs w:val="38"/>
+          <w:sz w:val="36"/>
+          <w:szCs w:val="36"/>
         </w:rPr>
         <w:t xml:space="preserve">What I Wish I Knew Before My First White-Label Partnership</w:t>
       </w:r>
@@ -183,7 +183,7 @@
           <w:sz w:val="14"/>
           <w:szCs w:val="14"/>
         </w:rPr>
-        <w:t xml:space="preserve">VOICE   </w:t>
+        <w:t xml:space="preserve">INTERNAL LINKS   </w:t>
       </w:r>
       <w:r>
         <w:rPr>
@@ -194,7 +194,7 @@
           <w:sz w:val="17"/>
           <w:szCs w:val="17"/>
         </w:rPr>
-        <w:t xml:space="preserve">First person, practitioner sharing experience. Opinionated, specific, admits trade-offs. Australian spelling, few em-dashes, no hype.</w:t>
+        <w:t xml:space="preserve">6 placed inline, marked [/path]. Anchor text is natural; the tag is for the publisher.</w:t>
       </w:r>
     </w:p>
     <w:p>
@@ -221,109 +221,132 @@
           <w:sz w:val="20"/>
           <w:szCs w:val="20"/>
         </w:rPr>
-        <w:t xml:space="preserve">Before publishing — confirm these</w:t>
-      </w:r>
-    </w:p>
-    <w:p>
-      <w:pPr>
-        <w:spacing w:after="50"/>
-      </w:pPr>
-      <w:r>
-        <w:rPr>
-          <w:rFonts w:ascii="Consolas" w:cs="Consolas" w:eastAsia="Consolas" w:hAnsi="Consolas"/>
+        <w:t xml:space="preserve">Reconciled with the live site, 12 Sep 2026</w:t>
+      </w:r>
+    </w:p>
+    <w:p>
+      <w:pPr>
+        <w:spacing w:after="40"/>
+      </w:pPr>
+      <w:r>
+        <w:rPr>
+          <w:rFonts w:ascii="Calibri" w:cs="Calibri" w:eastAsia="Calibri" w:hAnsi="Calibri"/>
+          <w:b/>
+          <w:bCs/>
+          <w:color w:val="2E7D5B"/>
+          <w:sz w:val="16"/>
+          <w:szCs w:val="16"/>
+        </w:rPr>
+        <w:t xml:space="preserve">✓ </w:t>
+      </w:r>
+      <w:r>
+        <w:rPr>
+          <w:rFonts w:ascii="Calibri" w:cs="Calibri" w:eastAsia="Calibri" w:hAnsi="Calibri"/>
+          <w:color w:val="5A6675"/>
+          <w:sz w:val="16"/>
+          <w:szCs w:val="16"/>
+        </w:rPr>
+        <w:t xml:space="preserve">Compliance now matches trillet.ai: SOC 2 Type II, ISO 27001, and operation under HIPAA, GDPR, ACMA, TCPA. Removed the earlier unverified “included on every plan at no extra cost” claim.</w:t>
+      </w:r>
+    </w:p>
+    <w:p>
+      <w:pPr>
+        <w:spacing w:after="40"/>
+      </w:pPr>
+      <w:r>
+        <w:rPr>
+          <w:rFonts w:ascii="Calibri" w:cs="Calibri" w:eastAsia="Calibri" w:hAnsi="Calibri"/>
+          <w:b/>
+          <w:bCs/>
+          <w:color w:val="2E7D5B"/>
+          <w:sz w:val="16"/>
+          <w:szCs w:val="16"/>
+        </w:rPr>
+        <w:t xml:space="preserve">✓ </w:t>
+      </w:r>
+      <w:r>
+        <w:rPr>
+          <w:rFonts w:ascii="Calibri" w:cs="Calibri" w:eastAsia="Calibri" w:hAnsi="Calibri"/>
+          <w:color w:val="5A6675"/>
+          <w:sz w:val="16"/>
+          <w:szCs w:val="16"/>
+        </w:rPr>
+        <w:t xml:space="preserve">Audit-trail claim verified and sharpened: the site states “full audit trails and role-based access on every client workspace,” with recordings and transcripts stored onshore.</w:t>
+      </w:r>
+    </w:p>
+    <w:p>
+      <w:pPr>
+        <w:spacing w:after="40"/>
+      </w:pPr>
+      <w:r>
+        <w:rPr>
+          <w:rFonts w:ascii="Calibri" w:cs="Calibri" w:eastAsia="Calibri" w:hAnsi="Calibri"/>
+          <w:b/>
+          <w:bCs/>
+          <w:color w:val="2E7D5B"/>
+          <w:sz w:val="16"/>
+          <w:szCs w:val="16"/>
+        </w:rPr>
+        <w:t xml:space="preserve">✓ </w:t>
+      </w:r>
+      <w:r>
+        <w:rPr>
+          <w:rFonts w:ascii="Calibri" w:cs="Calibri" w:eastAsia="Calibri" w:hAnsi="Calibri"/>
+          <w:color w:val="5A6675"/>
+          <w:sz w:val="16"/>
+          <w:szCs w:val="16"/>
+        </w:rPr>
+        <w:t xml:space="preserve">Partner structure corrected: the white-label platform (self-serve) is distinct from the three partnership tracks (reseller, referral, OEM). CTA now reflects this.</w:t>
+      </w:r>
+    </w:p>
+    <w:p>
+      <w:pPr>
+        <w:spacing w:after="40"/>
+      </w:pPr>
+      <w:r>
+        <w:rPr>
+          <w:rFonts w:ascii="Calibri" w:cs="Calibri" w:eastAsia="Calibri" w:hAnsi="Calibri"/>
+          <w:b/>
+          <w:bCs/>
+          <w:color w:val="2E7D5B"/>
+          <w:sz w:val="16"/>
+          <w:szCs w:val="16"/>
+        </w:rPr>
+        <w:t xml:space="preserve">✓ </w:t>
+      </w:r>
+      <w:r>
+        <w:rPr>
+          <w:rFonts w:ascii="Calibri" w:cs="Calibri" w:eastAsia="Calibri" w:hAnsi="Calibri"/>
+          <w:color w:val="5A6675"/>
+          <w:sz w:val="16"/>
+          <w:szCs w:val="16"/>
+        </w:rPr>
+        <w:t xml:space="preserve">Real usage figure used: $0.12/min (Studio $99/mo, Agency $299/mo per the live white-label page).</w:t>
+      </w:r>
+    </w:p>
+    <w:p>
+      <w:pPr>
+        <w:spacing w:after="40"/>
+      </w:pPr>
+      <w:r>
+        <w:rPr>
+          <w:rFonts w:ascii="Calibri" w:cs="Calibri" w:eastAsia="Calibri" w:hAnsi="Calibri"/>
           <w:b/>
           <w:bCs/>
           <w:color w:val="B4442E"/>
-          <w:sz w:val="14"/>
-          <w:szCs w:val="14"/>
-        </w:rPr>
-        <w:t xml:space="preserve">⚑ VERIFY  </w:t>
-      </w:r>
-      <w:r>
-        <w:rPr>
-          <w:rFonts w:ascii="Calibri" w:cs="Calibri" w:eastAsia="Calibri" w:hAnsi="Calibri"/>
-          <w:color w:val="5A6675"/>
-          <w:sz w:val="17"/>
-          <w:szCs w:val="17"/>
-        </w:rPr>
-        <w:t xml:space="preserve">Byline must be a real person with genuine agency/partner experience — the first-person voice only earns E-E-A-T if the author is real. Add author bio + credentials.</w:t>
-      </w:r>
-    </w:p>
-    <w:p>
-      <w:pPr>
-        <w:spacing w:after="70"/>
-      </w:pPr>
-      <w:r>
-        <w:rPr>
-          <w:rFonts w:ascii="Consolas" w:cs="Consolas" w:eastAsia="Consolas" w:hAnsi="Consolas"/>
-          <w:b/>
-          <w:bCs/>
-          <w:color w:val="9A6B3F"/>
-          <w:sz w:val="14"/>
-          <w:szCs w:val="14"/>
-        </w:rPr>
-        <w:t xml:space="preserve">[author note] </w:t>
-      </w:r>
-      <w:r>
-        <w:rPr>
-          <w:rFonts w:ascii="Calibri" w:cs="Calibri" w:eastAsia="Calibri" w:hAnsi="Calibri"/>
-          <w:i/>
-          <w:iCs/>
+          <w:sz w:val="16"/>
+          <w:szCs w:val="16"/>
+        </w:rPr>
+        <w:t xml:space="preserve">⚑ </w:t>
+      </w:r>
+      <w:r>
+        <w:rPr>
+          <w:rFonts w:ascii="Calibri" w:cs="Calibri" w:eastAsia="Calibri" w:hAnsi="Calibri"/>
           <w:color w:val="5A6675"/>
           <w:sz w:val="16"/>
           <w:szCs w:val="16"/>
         </w:rPr>
-        <w:t xml:space="preserve">Where you see [author note], drop in one true, specific detail from your own experience (a real client count, a real month it went wrong, a real number). Do not invent — replace with something true or cut it.</w:t>
-      </w:r>
-    </w:p>
-    <w:p>
-      <w:pPr>
-        <w:spacing w:after="50"/>
-      </w:pPr>
-      <w:r>
-        <w:rPr>
-          <w:rFonts w:ascii="Consolas" w:cs="Consolas" w:eastAsia="Consolas" w:hAnsi="Consolas"/>
-          <w:b/>
-          <w:bCs/>
-          <w:color w:val="B4442E"/>
-          <w:sz w:val="14"/>
-          <w:szCs w:val="14"/>
-        </w:rPr>
-        <w:t xml:space="preserve">⚑ VERIFY  </w:t>
-      </w:r>
-      <w:r>
-        <w:rPr>
-          <w:rFonts w:ascii="Calibri" w:cs="Calibri" w:eastAsia="Calibri" w:hAnsi="Calibri"/>
-          <w:color w:val="5A6675"/>
-          <w:sz w:val="17"/>
-          <w:szCs w:val="17"/>
-        </w:rPr>
-        <w:t xml:space="preserve">Trillet pricing is cited inconsistently across the site. Use margin framing here; confirm any figure against the canonical /whitelabel/pricing before publish.</w:t>
-      </w:r>
-    </w:p>
-    <w:p>
-      <w:pPr>
-        <w:spacing w:after="50"/>
-      </w:pPr>
-      <w:r>
-        <w:rPr>
-          <w:rFonts w:ascii="Consolas" w:cs="Consolas" w:eastAsia="Consolas" w:hAnsi="Consolas"/>
-          <w:b/>
-          <w:bCs/>
-          <w:color w:val="B4442E"/>
-          <w:sz w:val="14"/>
-          <w:szCs w:val="14"/>
-        </w:rPr>
-        <w:t xml:space="preserve">⚑ VERIFY  </w:t>
-      </w:r>
-      <w:r>
-        <w:rPr>
-          <w:rFonts w:ascii="Calibri" w:cs="Calibri" w:eastAsia="Calibri" w:hAnsi="Calibri"/>
-          <w:color w:val="5A6675"/>
-          <w:sz w:val="17"/>
-          <w:szCs w:val="17"/>
-        </w:rPr>
-        <w:t xml:space="preserve">Confirm current certifications (HIPAA, SOC 2, TCPA, GDPR, ACMA) and the audit-trail / on-prem claims are accurate and cleared for public copy.</w:t>
+        <w:t xml:space="preserve">Re-confirm pricing and certifications at publish; both can change. On-premise/data-residency is enterprise-tier; the copy does not imply it is universal.</w:t>
       </w:r>
     </w:p>
     <w:p>
@@ -352,7 +375,7 @@
           <w:sz w:val="20"/>
           <w:szCs w:val="20"/>
         </w:rPr>
-        <w:t xml:space="preserve">I have watched white-label partnerships make an agency’s year, and I have watched them quietly bleed one dry. The product was rarely the thing that decided it. What decided it was the boring stuff nobody asks about on the sales call: who actually answers when something breaks, whether the numbers still work after the vendor raises its rates, and whether you can prove what your AI said when a client’s customer swears it said something else.</w:t>
+        <w:t xml:space="preserve">I have watched white-label partnerships make an agency’s year, and I have watched them slowly sink one. The product was rarely what decided which way it went. What decided it was the unglamorous stuff nobody raises on the sales call: who answers when something breaks, whether the numbers still work after the vendor lifts its rates, and whether you can prove what your AI said when a client’s customer swears it said something else.</w:t>
       </w:r>
     </w:p>
     <w:p>
@@ -370,34 +393,7 @@
           <w:sz w:val="20"/>
           <w:szCs w:val="20"/>
         </w:rPr>
-        <w:t xml:space="preserve">So before the definitions, the honest version. A white-label partnership means you sell someone else’s product under your own brand: the vendor builds it and keeps it running, you rebrand it, price it, sell it, and own the client. That part is simple. Everything the sales page leaves out is what this is about, because that is where the money is made or lost.</w:t>
-      </w:r>
-    </w:p>
-    <w:p>
-      <w:pPr>
-        <w:spacing w:after="70"/>
-      </w:pPr>
-      <w:r>
-        <w:rPr>
-          <w:rFonts w:ascii="Consolas" w:cs="Consolas" w:eastAsia="Consolas" w:hAnsi="Consolas"/>
-          <w:b/>
-          <w:bCs/>
-          <w:color w:val="9A6B3F"/>
-          <w:sz w:val="14"/>
-          <w:szCs w:val="14"/>
-        </w:rPr>
-        <w:t xml:space="preserve">[author note] </w:t>
-      </w:r>
-      <w:r>
-        <w:rPr>
-          <w:rFonts w:ascii="Calibri" w:cs="Calibri" w:eastAsia="Calibri" w:hAnsi="Calibri"/>
-          <w:i/>
-          <w:iCs/>
-          <w:color w:val="5A6675"/>
-          <w:sz w:val="16"/>
-          <w:szCs w:val="16"/>
-        </w:rPr>
-        <w:t xml:space="preserve">If you have a two-line origin story — the first partnership you signed, good or bad — open with it instead of the generic first line. A real scene beats a clever sentence.</w:t>
+        <w:t xml:space="preserve">Here is the plain version before the detail. A white-label partnership means you sell someone else’s product under your own brand. The vendor builds it and keeps it running; you rebrand it, price it, sell it, and own the client. The rest of this covers what the sales page skips, because that is what decides whether the deal actually makes you money.</w:t>
       </w:r>
     </w:p>
     <w:p>
@@ -413,7 +409,7 @@
           <w:sz w:val="25"/>
           <w:szCs w:val="25"/>
         </w:rPr>
-        <w:t xml:space="preserve">The labels get blurred on purpose — know which one you’re signing</w:t>
+        <w:t xml:space="preserve">The labels get blurred, so know which one you’re signing</w:t>
       </w:r>
     </w:p>
     <w:p>
@@ -431,7 +427,7 @@
           <w:sz w:val="20"/>
           <w:szCs w:val="20"/>
         </w:rPr>
-        <w:t xml:space="preserve">The first thing I got wrong was assuming “white-label” meant one thing. It doesn’t, and the differences are usually softened on a sales call because the vendor wants you comfortable. They decide how much control and how much margin you actually walk away with.</w:t>
+        <w:t xml:space="preserve">The first thing I got wrong was assuming white-label meant one fixed thing. It does not, and vendors tend to soften the differences on a call because they want you comfortable. Those differences decide how much control and how much margin you keep.</w:t>
       </w:r>
     </w:p>
     <w:tbl>
@@ -519,7 +515,7 @@
                 <w:sz w:val="15"/>
                 <w:szCs w:val="15"/>
               </w:rPr>
-              <w:t xml:space="preserve">What you’re actually getting</w:t>
+              <w:t xml:space="preserve">What you actually get</w:t>
             </w:r>
           </w:p>
         </w:tc>
@@ -623,7 +619,7 @@
                 <w:sz w:val="14"/>
                 <w:szCs w:val="14"/>
               </w:rPr>
-              <w:t xml:space="preserve">The product sold fully as your brand — your name, your pricing.</w:t>
+              <w:t xml:space="preserve">The product sold fully as your brand, your pricing.</w:t>
             </w:r>
           </w:p>
         </w:tc>
@@ -797,7 +793,7 @@
                 <w:sz w:val="14"/>
                 <w:szCs w:val="14"/>
               </w:rPr>
-              <w:t xml:space="preserve">Referral / affiliate</w:t>
+              <w:t xml:space="preserve">Referral</w:t>
             </w:r>
           </w:p>
         </w:tc>
@@ -990,7 +986,7 @@
           <w:sz w:val="20"/>
           <w:szCs w:val="20"/>
         </w:rPr>
-        <w:t xml:space="preserve">If the contract says “white-label” but the dashboard still shows the vendor’s name and the billing comes from them, you have a reseller deal with better marketing. Ask to see the actual branded product before you believe the label.</w:t>
+        <w:t xml:space="preserve">If the contract says white-label but the dashboard still shows the vendor’s name and the invoices come from them, you have a reseller arrangement with better marketing. Ask to see the branded product working before you trust the label.</w:t>
       </w:r>
     </w:p>
     <w:p>
@@ -1024,7 +1020,7 @@
           <w:sz w:val="20"/>
           <w:szCs w:val="20"/>
         </w:rPr>
-        <w:t xml:space="preserve">The pitch is always the same: pay wholesale, charge retail, keep the difference, and it recurs every month. True. But I have seen two things quietly eat that margin, and both are avoidable if you know to look.</w:t>
+        <w:t xml:space="preserve">The pitch rarely changes: pay wholesale, charge retail, keep the difference, and it recurs every month. That part holds. Two things erode the margin, and both are avoidable once you know to look.</w:t>
       </w:r>
     </w:p>
     <w:p>
@@ -1042,7 +1038,7 @@
           <w:sz w:val="20"/>
           <w:szCs w:val="20"/>
         </w:rPr>
-        <w:t xml:space="preserve">The first is pricing a usage-based cost as if it were fixed. Most AI platforms bill you per minute or per interaction. If you sell your client a flat monthly price and one heavy user runs up the usage, your margin on that account can go to nothing without you noticing for a quarter. Price with a usage band, or watch your best-looking client become your worst.</w:t>
+        <w:t xml:space="preserve">The first is pricing a usage-based cost as if it were fixed. Most AI platforms bill per minute or per interaction. Trillet’s usage runs at $0.12 a minute, for instance. If you sell a client a flat monthly price and one heavy user runs the minutes up, your margin on that account can fall to nothing before you notice. Price with a usage band rather than a flat rate you will regret later.</w:t>
       </w:r>
     </w:p>
     <w:p>
@@ -1060,60 +1056,71 @@
           <w:sz w:val="20"/>
           <w:szCs w:val="20"/>
         </w:rPr>
-        <w:t xml:space="preserve">The second is the slow rate creep. You lock your client’s price to win the deal. Then the vendor lifts its wholesale rate, or moves a feature you rely on into a higher tier, and the squeeze lands entirely on you. I now assume wholesale pricing will move and I ask, in writing, how much and how often it can. The real numbers behind a healthy recurring margin are in our </w:t>
-      </w:r>
-      <w:r>
-        <w:rPr>
-          <w:rFonts w:ascii="Calibri" w:cs="Calibri" w:eastAsia="Calibri" w:hAnsi="Calibri"/>
-          <w:b/>
-          <w:bCs/>
-          <w:i w:val="false"/>
-          <w:iCs w:val="false"/>
-          <w:color w:val="24303F"/>
-          <w:sz w:val="20"/>
-          <w:szCs w:val="20"/>
+        <w:t xml:space="preserve">The second is rate creep. You lock a client’s price to win the deal, then the vendor lifts its wholesale rate or moves a feature you rely on into a higher tier, and the squeeze lands on you. I now assume wholesale pricing will move, and I ask in writing how far and how often it can. The numbers behind a healthy recurring margin are in our </w:t>
+      </w:r>
+      <w:r>
+        <w:rPr>
+          <w:rFonts w:ascii="Calibri" w:cs="Calibri" w:eastAsia="Calibri" w:hAnsi="Calibri"/>
+          <w:color w:val="1B5E86"/>
+          <w:sz w:val="20"/>
+          <w:szCs w:val="20"/>
+          <w:u w:val="single"/>
         </w:rPr>
         <w:t xml:space="preserve">white-label profit margins</w:t>
       </w:r>
       <w:r>
         <w:rPr>
-          <w:rFonts w:ascii="Calibri" w:cs="Calibri" w:eastAsia="Calibri" w:hAnsi="Calibri"/>
-          <w:b w:val="false"/>
-          <w:bCs w:val="false"/>
-          <w:i w:val="false"/>
-          <w:iCs w:val="false"/>
-          <w:color w:val="24303F"/>
-          <w:sz w:val="20"/>
-          <w:szCs w:val="20"/>
-        </w:rPr>
-        <w:t xml:space="preserve"> breakdown.</w:t>
-      </w:r>
-    </w:p>
-    <w:p>
-      <w:pPr>
-        <w:spacing w:after="70"/>
-      </w:pPr>
-      <w:r>
-        <w:rPr>
           <w:rFonts w:ascii="Consolas" w:cs="Consolas" w:eastAsia="Consolas" w:hAnsi="Consolas"/>
-          <w:b/>
-          <w:bCs/>
-          <w:color w:val="9A6B3F"/>
-          <w:sz w:val="14"/>
-          <w:szCs w:val="14"/>
-        </w:rPr>
-        <w:t xml:space="preserve">[author note] </w:t>
-      </w:r>
-      <w:r>
-        <w:rPr>
-          <w:rFonts w:ascii="Calibri" w:cs="Calibri" w:eastAsia="Calibri" w:hAnsi="Calibri"/>
-          <w:i/>
-          <w:iCs/>
           <w:color w:val="5A6675"/>
-          <w:sz w:val="16"/>
-          <w:szCs w:val="16"/>
-        </w:rPr>
-        <w:t xml:space="preserve">A single real number here would carry the whole section — e.g. ‘one client’s usage tripled and my margin on them dropped from X% to Y%’. Use a true one or leave it out.</w:t>
+          <w:sz w:val="12"/>
+          <w:szCs w:val="12"/>
+        </w:rPr>
+        <w:t xml:space="preserve"> [/blogs/white-label-ai-profit-margins]</w:t>
+      </w:r>
+      <w:r>
+        <w:rPr>
+          <w:rFonts w:ascii="Calibri" w:cs="Calibri" w:eastAsia="Calibri" w:hAnsi="Calibri"/>
+          <w:b w:val="false"/>
+          <w:bCs w:val="false"/>
+          <w:i w:val="false"/>
+          <w:iCs w:val="false"/>
+          <w:color w:val="24303F"/>
+          <w:sz w:val="20"/>
+          <w:szCs w:val="20"/>
+        </w:rPr>
+        <w:t xml:space="preserve"> breakdown. A few agencies weigh building their own on Vapi or Retell instead of reselling; that </w:t>
+      </w:r>
+      <w:r>
+        <w:rPr>
+          <w:rFonts w:ascii="Calibri" w:cs="Calibri" w:eastAsia="Calibri" w:hAnsi="Calibri"/>
+          <w:color w:val="1B5E86"/>
+          <w:sz w:val="20"/>
+          <w:szCs w:val="20"/>
+          <w:u w:val="single"/>
+        </w:rPr>
+        <w:t xml:space="preserve">build-versus-buy call</w:t>
+      </w:r>
+      <w:r>
+        <w:rPr>
+          <w:rFonts w:ascii="Consolas" w:cs="Consolas" w:eastAsia="Consolas" w:hAnsi="Consolas"/>
+          <w:color w:val="5A6675"/>
+          <w:sz w:val="12"/>
+          <w:szCs w:val="12"/>
+        </w:rPr>
+        <w:t xml:space="preserve"> [/blogs/build-on-vapi-retell-vs-buy-white-label]</w:t>
+      </w:r>
+      <w:r>
+        <w:rPr>
+          <w:rFonts w:ascii="Calibri" w:cs="Calibri" w:eastAsia="Calibri" w:hAnsi="Calibri"/>
+          <w:b w:val="false"/>
+          <w:bCs w:val="false"/>
+          <w:i w:val="false"/>
+          <w:iCs w:val="false"/>
+          <w:color w:val="24303F"/>
+          <w:sz w:val="20"/>
+          <w:szCs w:val="20"/>
+        </w:rPr>
+        <w:t xml:space="preserve"> is its own exercise.</w:t>
       </w:r>
     </w:p>
     <w:p>
@@ -1129,7 +1136,7 @@
           <w:sz w:val="25"/>
           <w:szCs w:val="25"/>
         </w:rPr>
-        <w:t xml:space="preserve">The 2am problem: you own every mistake</w:t>
+        <w:t xml:space="preserve">You own every mistake the agent makes</w:t>
       </w:r>
     </w:p>
     <w:p>
@@ -1147,7 +1154,7 @@
           <w:sz w:val="20"/>
           <w:szCs w:val="20"/>
         </w:rPr>
-        <w:t xml:space="preserve">This is the one nobody warns you about, and it’s the one that has cost me the most sleep. When the agent is wearing your brand, every wrong answer, every fabricated policy, every botched booking reads to the client’s customer as your company’s mistake. Not the vendor’s. Yours.</w:t>
+        <w:t xml:space="preserve">This is the risk people underestimate, and the one that has cost me the most sleep. When the agent wears your brand, a wrong answer, an invented policy or a botched booking reads to the client’s customer as your company’s error rather than the vendor’s.</w:t>
       </w:r>
     </w:p>
     <w:p>
@@ -1165,7 +1172,7 @@
           <w:sz w:val="20"/>
           <w:szCs w:val="20"/>
         </w:rPr>
-        <w:t xml:space="preserve">It gets worse at the support desk. The customer complains to your client, your client complains to you, and you turn to the vendor holding a ticket with none of the detail attached: no recording, no transcript, no log of what the agent actually did or which tool it called. You end up apologising for something you cannot see, to a client who is watching how you handle it.</w:t>
+        <w:t xml:space="preserve">It is harder at the support desk. The customer complains to your client, your client comes to you, and you go to the vendor holding a ticket with none of the detail attached: no recording, no transcript, no log of what the agent said or which tool it called. You end up apologising for something you cannot see, while your client watches how you handle it.</w:t>
       </w:r>
     </w:p>
     <w:p>
@@ -1183,33 +1190,39 @@
           <w:sz w:val="20"/>
           <w:szCs w:val="20"/>
         </w:rPr>
-        <w:t xml:space="preserve">This is the exact reason I now treat one question as non-negotiable: can I pull a verifiable record of every conversation, on demand, myself? If the platform can’t show me what its own agent said, I can’t defend my brand, and I’m not putting my name on it. It’s also where Trillet started from a different place — every conversation lands in an auditable record, and compliance (HIPAA, SOC 2, TCPA, GDPR, ACMA) is included on every plan rather than sold back to you as an upgrade. When your clients are clinics or law firms, that stops being a nice-to-have. See </w:t>
-      </w:r>
-      <w:r>
-        <w:rPr>
-          <w:rFonts w:ascii="Calibri" w:cs="Calibri" w:eastAsia="Calibri" w:hAnsi="Calibri"/>
-          <w:b/>
-          <w:bCs/>
-          <w:i w:val="false"/>
-          <w:iCs w:val="false"/>
-          <w:color w:val="24303F"/>
-          <w:sz w:val="20"/>
-          <w:szCs w:val="20"/>
+        <w:t xml:space="preserve">So I treat one question as non-negotiable now: can I pull a full record of any conversation myself, on demand? If a platform cannot show me what its own agent said, I cannot stand behind my brand. This is where Trillet’s setup differs. Every client workspace carries full audit trails and role-based access, and recordings and transcripts are kept, so a disputed call is something you open rather than guess at. Compliance is built into the platform too: SOC 2 Type II and ISO 27001, and operation under HIPAA, GDPR, ACMA and TCPA, which counts for a lot when your clients are clinics or law firms. Our </w:t>
+      </w:r>
+      <w:r>
+        <w:rPr>
+          <w:rFonts w:ascii="Calibri" w:cs="Calibri" w:eastAsia="Calibri" w:hAnsi="Calibri"/>
+          <w:color w:val="1B5E86"/>
+          <w:sz w:val="20"/>
+          <w:szCs w:val="20"/>
+          <w:u w:val="single"/>
         </w:rPr>
         <w:t xml:space="preserve">white-label AI with built-in compliance</w:t>
       </w:r>
       <w:r>
         <w:rPr>
-          <w:rFonts w:ascii="Calibri" w:cs="Calibri" w:eastAsia="Calibri" w:hAnsi="Calibri"/>
-          <w:b w:val="false"/>
-          <w:bCs w:val="false"/>
-          <w:i w:val="false"/>
-          <w:iCs w:val="false"/>
-          <w:color w:val="24303F"/>
-          <w:sz w:val="20"/>
-          <w:szCs w:val="20"/>
-        </w:rPr>
-        <w:t xml:space="preserve"> for how that works.</w:t>
+          <w:rFonts w:ascii="Consolas" w:cs="Consolas" w:eastAsia="Consolas" w:hAnsi="Consolas"/>
+          <w:color w:val="5A6675"/>
+          <w:sz w:val="12"/>
+          <w:szCs w:val="12"/>
+        </w:rPr>
+        <w:t xml:space="preserve"> [/blogs/white-label-ai-with-built-in-compliance]</w:t>
+      </w:r>
+      <w:r>
+        <w:rPr>
+          <w:rFonts w:ascii="Calibri" w:cs="Calibri" w:eastAsia="Calibri" w:hAnsi="Calibri"/>
+          <w:b w:val="false"/>
+          <w:bCs w:val="false"/>
+          <w:i w:val="false"/>
+          <w:iCs w:val="false"/>
+          <w:color w:val="24303F"/>
+          <w:sz w:val="20"/>
+          <w:szCs w:val="20"/>
+        </w:rPr>
+        <w:t xml:space="preserve"> page covers how that works in practice.</w:t>
       </w:r>
     </w:p>
     <w:p>
@@ -1243,7 +1256,7 @@
           <w:sz w:val="20"/>
           <w:szCs w:val="20"/>
         </w:rPr>
-        <w:t xml:space="preserve">After a couple of expensive lessons, I stopped being dazzled by the demo and started working through the same list every time. The left column is what I ask. The right column is what makes me walk.</w:t>
+        <w:t xml:space="preserve">After a couple of expensive lessons I stopped being swayed by the demo and started working the same list every time. The left column is what I ask. The right column is what makes me walk away.</w:t>
       </w:r>
     </w:p>
     <w:tbl>
@@ -1469,7 +1482,7 @@
                 <w:sz w:val="14"/>
                 <w:szCs w:val="14"/>
               </w:rPr>
-              <w:t xml:space="preserve">Usage pricing that swings in ways I can’t predict.</w:t>
+              <w:t xml:space="preserve">Usage pricing that swings in ways I cannot predict.</w:t>
             </w:r>
           </w:p>
         </w:tc>
@@ -1539,7 +1552,7 @@
                 <w:sz w:val="14"/>
                 <w:szCs w:val="14"/>
               </w:rPr>
-              <w:t xml:space="preserve">My domain, my dashboard, my billing. Client never meets the vendor.</w:t>
+              <w:t xml:space="preserve">My domain, my dashboard, my billing. The client never meets the vendor.</w:t>
             </w:r>
           </w:p>
         </w:tc>
@@ -1851,7 +1864,7 @@
                 <w:sz w:val="14"/>
                 <w:szCs w:val="14"/>
               </w:rPr>
-              <w:t xml:space="preserve">Clear term, priced locks, my data stays mine, clean exit.</w:t>
+              <w:t xml:space="preserve">Clear term, priced locks, my data stays mine, a clean exit.</w:t>
             </w:r>
           </w:p>
         </w:tc>
@@ -1955,7 +1968,7 @@
                 <w:sz w:val="14"/>
                 <w:szCs w:val="14"/>
               </w:rPr>
-              <w:t xml:space="preserve">Included and provable, not an add-on.</w:t>
+              <w:t xml:space="preserve">Certified and provable, backed by a real record.</w:t>
             </w:r>
           </w:p>
         </w:tc>
@@ -1989,7 +2002,7 @@
                 <w:sz w:val="14"/>
                 <w:szCs w:val="14"/>
               </w:rPr>
-              <w:t xml:space="preserve">Compliance as an upsell, or hand-waving.</w:t>
+              <w:t xml:space="preserve">Compliance treated as an upsell, or hand-waving.</w:t>
             </w:r>
           </w:p>
         </w:tc>
@@ -2026,7 +2039,7 @@
           <w:sz w:val="20"/>
           <w:szCs w:val="20"/>
         </w:rPr>
-        <w:t xml:space="preserve">A white-label deal is a multi-year commitment whether the contract says so or not, because moving vendors later means re-platforming every client you signed. So I get these in writing before anything else:</w:t>
+        <w:t xml:space="preserve">A white-label deal is a multi-year commitment whether the contract admits it or not, because switching vendors later means re-platforming every client you signed. I get these in writing first:</w:t>
       </w:r>
     </w:p>
     <w:p>
@@ -2062,7 +2075,7 @@
           <w:sz w:val="20"/>
           <w:szCs w:val="20"/>
         </w:rPr>
-        <w:t xml:space="preserve">How much the wholesale rate can move, and how often. I have watched a “1% fee” quietly become 10%.</w:t>
+        <w:t xml:space="preserve">How far the wholesale rate can move, and how often. I have seen a small top-up fee climb sharply once agencies were already committed.</w:t>
       </w:r>
     </w:p>
     <w:p>
@@ -2085,7 +2098,7 @@
           <w:sz w:val="20"/>
           <w:szCs w:val="20"/>
         </w:rPr>
-        <w:t xml:space="preserve">My data is mine. </w:t>
+        <w:t xml:space="preserve">My data stays mine. </w:t>
       </w:r>
       <w:r>
         <w:rPr>
@@ -2134,7 +2147,7 @@
           <w:sz w:val="20"/>
           <w:szCs w:val="20"/>
         </w:rPr>
-        <w:t xml:space="preserve">What happens to my live clients the day I leave.</w:t>
+        <w:t xml:space="preserve">What happens to live clients the day I leave.</w:t>
       </w:r>
     </w:p>
     <w:p>
@@ -2170,7 +2183,7 @@
           <w:sz w:val="20"/>
           <w:szCs w:val="20"/>
         </w:rPr>
-        <w:t xml:space="preserve">Warning before a feature I sell on gets moved or killed.</w:t>
+        <w:t xml:space="preserve">Fair warning before a feature I sell on gets moved or removed.</w:t>
       </w:r>
     </w:p>
     <w:p>
@@ -2188,7 +2201,7 @@
           <w:sz w:val="20"/>
           <w:szCs w:val="20"/>
         </w:rPr>
-        <w:t xml:space="preserve">None of this is legal advice, and I still have a lawyer read anything before I sign. But going in knowing what to protect changes the conversation.</w:t>
+        <w:t xml:space="preserve">None of this is legal advice, and I still have a lawyer read anything before signing. Going in knowing what to protect changes the whole conversation.</w:t>
       </w:r>
     </w:p>
     <w:p>
@@ -2222,33 +2235,71 @@
           <w:sz w:val="20"/>
           <w:szCs w:val="20"/>
         </w:rPr>
-        <w:t xml:space="preserve">I won’t pretend it fits everyone. White-label voice AI works best when your clients live on the phone and lose real money on a missed call: legal intake, medical reception, home services, real estate. Those are also the clients who care most about compliance and a defensible record, which is where a serious platform earns its price. If your clients won’t pay monthly, or you can’t staff even light support, this model will frustrate you. Better to know that now. If it does fit, Trillet’s </w:t>
-      </w:r>
-      <w:r>
-        <w:rPr>
-          <w:rFonts w:ascii="Calibri" w:cs="Calibri" w:eastAsia="Calibri" w:hAnsi="Calibri"/>
-          <w:b/>
-          <w:bCs/>
-          <w:i w:val="false"/>
-          <w:iCs w:val="false"/>
-          <w:color w:val="24303F"/>
-          <w:sz w:val="20"/>
-          <w:szCs w:val="20"/>
+        <w:t xml:space="preserve">It does not fit everyone. White-label voice AI works best when your clients live on the phone and lose real money on a missed call: </w:t>
+      </w:r>
+      <w:r>
+        <w:rPr>
+          <w:rFonts w:ascii="Calibri" w:cs="Calibri" w:eastAsia="Calibri" w:hAnsi="Calibri"/>
+          <w:color w:val="1B5E86"/>
+          <w:sz w:val="20"/>
+          <w:szCs w:val="20"/>
+          <w:u w:val="single"/>
+        </w:rPr>
+        <w:t xml:space="preserve">legal intake</w:t>
+      </w:r>
+      <w:r>
+        <w:rPr>
+          <w:rFonts w:ascii="Consolas" w:cs="Consolas" w:eastAsia="Consolas" w:hAnsi="Consolas"/>
+          <w:color w:val="5A6675"/>
+          <w:sz w:val="12"/>
+          <w:szCs w:val="12"/>
+        </w:rPr>
+        <w:t xml:space="preserve"> [/blogs/ai-receptionist-for-law-firms-white-label]</w:t>
+      </w:r>
+      <w:r>
+        <w:rPr>
+          <w:rFonts w:ascii="Calibri" w:cs="Calibri" w:eastAsia="Calibri" w:hAnsi="Calibri"/>
+          <w:b w:val="false"/>
+          <w:bCs w:val="false"/>
+          <w:i w:val="false"/>
+          <w:iCs w:val="false"/>
+          <w:color w:val="24303F"/>
+          <w:sz w:val="20"/>
+          <w:szCs w:val="20"/>
+        </w:rPr>
+        <w:t xml:space="preserve">, medical reception, home services, real estate. Those are also the clients who care most about compliance and a defensible record, which is where a serious platform pays for itself. If your clients will not pay monthly, or you cannot staff even light support, the model will frustrate you. Where it fits, Trillet’s </w:t>
+      </w:r>
+      <w:r>
+        <w:rPr>
+          <w:rFonts w:ascii="Calibri" w:cs="Calibri" w:eastAsia="Calibri" w:hAnsi="Calibri"/>
+          <w:color w:val="1B5E86"/>
+          <w:sz w:val="20"/>
+          <w:szCs w:val="20"/>
+          <w:u w:val="single"/>
         </w:rPr>
         <w:t xml:space="preserve">white-label voice AI platform</w:t>
       </w:r>
       <w:r>
         <w:rPr>
-          <w:rFonts w:ascii="Calibri" w:cs="Calibri" w:eastAsia="Calibri" w:hAnsi="Calibri"/>
-          <w:b w:val="false"/>
-          <w:bCs w:val="false"/>
-          <w:i w:val="false"/>
-          <w:iCs w:val="false"/>
-          <w:color w:val="24303F"/>
-          <w:sz w:val="20"/>
-          <w:szCs w:val="20"/>
-        </w:rPr>
-        <w:t xml:space="preserve"> is built for exactly these resale motions.</w:t>
+          <w:rFonts w:ascii="Consolas" w:cs="Consolas" w:eastAsia="Consolas" w:hAnsi="Consolas"/>
+          <w:color w:val="5A6675"/>
+          <w:sz w:val="12"/>
+          <w:szCs w:val="12"/>
+        </w:rPr>
+        <w:t xml:space="preserve"> [/whitelabel]</w:t>
+      </w:r>
+      <w:r>
+        <w:rPr>
+          <w:rFonts w:ascii="Calibri" w:cs="Calibri" w:eastAsia="Calibri" w:hAnsi="Calibri"/>
+          <w:b w:val="false"/>
+          <w:bCs w:val="false"/>
+          <w:i w:val="false"/>
+          <w:iCs w:val="false"/>
+          <w:color w:val="24303F"/>
+          <w:sz w:val="20"/>
+          <w:szCs w:val="20"/>
+        </w:rPr>
+        <w:t xml:space="preserve"> is built for these resale motions, and the compliance that protects a law firm’s intake is the same compliance protecting your brand when you resell it.</w:t>
       </w:r>
     </w:p>
     <w:p>
@@ -2282,7 +2333,7 @@
           <w:sz w:val="20"/>
           <w:szCs w:val="20"/>
         </w:rPr>
-        <w:t xml:space="preserve">Start narrow. Pick one vertical you already understand, sign two or three clients before you touch your pricing page, and price for a margin you can defend when usage moves. Lead with the record-keeping and compliance if your clients are regulated, because that is the part your competitors are hand-waving. Keep the onboarding tight and boring; boring is what renews.</w:t>
+        <w:t xml:space="preserve">Start narrow. Pick one vertical you already understand, sign two or three clients before you touch your pricing page, and price for a margin that survives a jump in usage. Lead with the record-keeping and compliance where your clients are regulated, since that is the part most competitors gloss over. Keep onboarding tight and repeatable.</w:t>
       </w:r>
     </w:p>
     <w:p>
@@ -2300,59 +2351,71 @@
           <w:sz w:val="20"/>
           <w:szCs w:val="20"/>
         </w:rPr>
-        <w:t xml:space="preserve">When you’re ready to look at platforms, Trillet runs three partner tracks — reseller, OEM and referral — so you can match the model to how much you actually want to operate. </w:t>
-      </w:r>
-      <w:r>
-        <w:rPr>
-          <w:rFonts w:ascii="Calibri" w:cs="Calibri" w:eastAsia="Calibri" w:hAnsi="Calibri"/>
-          <w:b/>
-          <w:bCs/>
-          <w:i w:val="false"/>
-          <w:iCs w:val="false"/>
-          <w:color w:val="24303F"/>
-          <w:sz w:val="20"/>
-          <w:szCs w:val="20"/>
-        </w:rPr>
-        <w:t xml:space="preserve">Have a look at the partner program</w:t>
-      </w:r>
-      <w:r>
-        <w:rPr>
-          <w:rFonts w:ascii="Calibri" w:cs="Calibri" w:eastAsia="Calibri" w:hAnsi="Calibri"/>
-          <w:b w:val="false"/>
-          <w:bCs w:val="false"/>
-          <w:i w:val="false"/>
-          <w:iCs w:val="false"/>
-          <w:color w:val="24303F"/>
-          <w:sz w:val="20"/>
-          <w:szCs w:val="20"/>
-        </w:rPr>
-        <w:t xml:space="preserve">, or compare the </w:t>
-      </w:r>
-      <w:r>
-        <w:rPr>
-          <w:rFonts w:ascii="Calibri" w:cs="Calibri" w:eastAsia="Calibri" w:hAnsi="Calibri"/>
-          <w:b/>
-          <w:bCs/>
-          <w:i w:val="false"/>
-          <w:iCs w:val="false"/>
-          <w:color w:val="24303F"/>
-          <w:sz w:val="20"/>
-          <w:szCs w:val="20"/>
-        </w:rPr>
-        <w:t xml:space="preserve">reseller options</w:t>
-      </w:r>
-      <w:r>
-        <w:rPr>
-          <w:rFonts w:ascii="Calibri" w:cs="Calibri" w:eastAsia="Calibri" w:hAnsi="Calibri"/>
-          <w:b w:val="false"/>
-          <w:bCs w:val="false"/>
-          <w:i w:val="false"/>
-          <w:iCs w:val="false"/>
-          <w:color w:val="24303F"/>
-          <w:sz w:val="20"/>
-          <w:szCs w:val="20"/>
-        </w:rPr>
-        <w:t xml:space="preserve"> first if you’re still deciding how hands-on to be.</w:t>
+        <w:t xml:space="preserve">When you compare platforms, note how Trillet splits the two paths. The white-label platform is self-serve for agencies building under their own brand. The reseller, referral and OEM tracks are formal partnerships with terms set around your volume. Match the path to how hands-on you want to be: the </w:t>
+      </w:r>
+      <w:r>
+        <w:rPr>
+          <w:rFonts w:ascii="Calibri" w:cs="Calibri" w:eastAsia="Calibri" w:hAnsi="Calibri"/>
+          <w:color w:val="1B5E86"/>
+          <w:sz w:val="20"/>
+          <w:szCs w:val="20"/>
+          <w:u w:val="single"/>
+        </w:rPr>
+        <w:t xml:space="preserve">partner program</w:t>
+      </w:r>
+      <w:r>
+        <w:rPr>
+          <w:rFonts w:ascii="Consolas" w:cs="Consolas" w:eastAsia="Consolas" w:hAnsi="Consolas"/>
+          <w:color w:val="5A6675"/>
+          <w:sz w:val="12"/>
+          <w:szCs w:val="12"/>
+        </w:rPr>
+        <w:t xml:space="preserve"> [/partners]</w:t>
+      </w:r>
+      <w:r>
+        <w:rPr>
+          <w:rFonts w:ascii="Calibri" w:cs="Calibri" w:eastAsia="Calibri" w:hAnsi="Calibri"/>
+          <w:b w:val="false"/>
+          <w:bCs w:val="false"/>
+          <w:i w:val="false"/>
+          <w:iCs w:val="false"/>
+          <w:color w:val="24303F"/>
+          <w:sz w:val="20"/>
+          <w:szCs w:val="20"/>
+        </w:rPr>
+        <w:t xml:space="preserve"> lays out the three tracks, and the </w:t>
+      </w:r>
+      <w:r>
+        <w:rPr>
+          <w:rFonts w:ascii="Calibri" w:cs="Calibri" w:eastAsia="Calibri" w:hAnsi="Calibri"/>
+          <w:color w:val="1B5E86"/>
+          <w:sz w:val="20"/>
+          <w:szCs w:val="20"/>
+          <w:u w:val="single"/>
+        </w:rPr>
+        <w:t xml:space="preserve">white-label platform</w:t>
+      </w:r>
+      <w:r>
+        <w:rPr>
+          <w:rFonts w:ascii="Consolas" w:cs="Consolas" w:eastAsia="Consolas" w:hAnsi="Consolas"/>
+          <w:color w:val="5A6675"/>
+          <w:sz w:val="12"/>
+          <w:szCs w:val="12"/>
+        </w:rPr>
+        <w:t xml:space="preserve"> [/whitelabel]</w:t>
+      </w:r>
+      <w:r>
+        <w:rPr>
+          <w:rFonts w:ascii="Calibri" w:cs="Calibri" w:eastAsia="Calibri" w:hAnsi="Calibri"/>
+          <w:b w:val="false"/>
+          <w:bCs w:val="false"/>
+          <w:i w:val="false"/>
+          <w:iCs w:val="false"/>
+          <w:color w:val="24303F"/>
+          <w:sz w:val="20"/>
+          <w:szCs w:val="20"/>
+        </w:rPr>
+        <w:t xml:space="preserve"> is the route if you would rather build and brand it yourself.</w:t>
       </w:r>
     </w:p>
     <w:p>
@@ -2418,7 +2481,7 @@
           <w:sz w:val="20"/>
           <w:szCs w:val="20"/>
         </w:rPr>
-        <w:t xml:space="preserve">White-label, reseller or OEM — what’s the real difference?</w:t>
+        <w:t xml:space="preserve">What’s the difference between white-label, reseller and OEM?</w:t>
       </w:r>
     </w:p>
     <w:p>
@@ -2452,7 +2515,7 @@
           <w:sz w:val="20"/>
           <w:szCs w:val="20"/>
         </w:rPr>
-        <w:t xml:space="preserve">How much margin can I actually keep?</w:t>
+        <w:t xml:space="preserve">How much margin can I keep?</w:t>
       </w:r>
     </w:p>
     <w:p>
@@ -2470,7 +2533,7 @@
           <w:sz w:val="20"/>
           <w:szCs w:val="20"/>
         </w:rPr>
-        <w:t xml:space="preserve">The gap between wholesale and your retail price, every month a client stays. It’s healthy and recurring, but usage-based costs can erode it, so price with a band, not a flat rate you’ll regret.</w:t>
+        <w:t xml:space="preserve">The gap between wholesale and your retail price, every month a client stays. It is healthy and recurring, but usage-based costs can erode it, so price with a band rather than a flat rate.</w:t>
       </w:r>
     </w:p>
     <w:p>
@@ -2504,7 +2567,7 @@
           <w:sz w:val="20"/>
           <w:szCs w:val="20"/>
         </w:rPr>
-        <w:t xml:space="preserve">That you own every mistake the AI makes under your brand. If you can’t pull a record of what the agent actually said, you can’t defend yourself when a client’s customer disputes a call.</w:t>
+        <w:t xml:space="preserve">That you own every mistake the AI makes under your brand. If you cannot pull a record of what the agent said, you cannot defend yourself when a client’s customer disputes a call.</w:t>
       </w:r>
     </w:p>
     <w:p>
@@ -2572,7 +2635,7 @@
           <w:sz w:val="20"/>
           <w:szCs w:val="20"/>
         </w:rPr>
-        <w:t xml:space="preserve">Only if the platform is genuinely compliant underneath. With Trillet, HIPAA, SOC 2, TCPA, GDPR and ACMA are included on every plan and every call is recorded to an auditable trail, so it carries through to your brand.</w:t>
+        <w:t xml:space="preserve">Only if the platform is genuinely compliant underneath. Trillet is SOC 2 Type II and ISO 27001 certified and operates under HIPAA, GDPR, ACMA and TCPA, with full audit trails on every client workspace, so it holds when you resell under your brand.</w:t>
       </w:r>
     </w:p>
     <w:p>
@@ -2617,7 +2680,7 @@
           <w:sz w:val="17"/>
           <w:szCs w:val="17"/>
         </w:rPr>
-        <w:t xml:space="preserve">Article + FAQPage + BreadcrumbList. The FAQ answers below must match the on-page FAQ verbatim.</w:t>
+        <w:t xml:space="preserve">Article + FAQPage + BreadcrumbList. FAQ answers must match the on-page FAQ verbatim; author must be a real person.</w:t>
       </w:r>
     </w:p>
     <w:tbl>
@@ -2776,7 +2839,7 @@
                 <w:sz w:val="13"/>
                 <w:szCs w:val="13"/>
               </w:rPr>
-              <w:t xml:space="preserve">  { "@type":"FAQPage","mainEntity":[ /* 6 Q&amp;As, text matching page */ ] },</w:t>
+              <w:t xml:space="preserve">  { "@type":"FAQPage","mainEntity":[ /* 6 Q&amp;As, text matching page verbatim */ ] },</w:t>
             </w:r>
           </w:p>
           <w:p>

</xml_diff>

<commit_message>
Reframe Blog 1 to founder voice; trim forced internal links
Rewrite in the founder's voice: resold voice AI for years, hit these
exact problems, built Trillet to fix them, and now shares how they would
approach a white-label partnership. Trillet references become earned
('the specific problem Trillet was built to end', 'when we built Trillet
we kept usage at a flat rate') rather than vendor insertions. Made the
section headings consistent in that first-person voice. Cut internal
links from six to four, dropping the two that read as forced (the
build-vs-buy aside and the lone vertical link); kept profit-margins,
built-in-compliance, /whitelabel and /partners where they fit
naturally. Added a flag that the founder-origin bio must be true of the
named author before publish.

Co-Authored-By: Claude Opus 4.8 <noreply@anthropic.com>
Claude-Session: https://claude.ai/code/session_01UhVChLeNNjFDr6eASTMGhh
</commit_message>
<xml_diff>
--- a/seo-audit/Article-01-White-Label-Partnerships-Guide.docx
+++ b/seo-audit/Article-01-White-Label-Partnerships-Guide.docx
@@ -113,7 +113,7 @@
           <w:sz w:val="14"/>
           <w:szCs w:val="14"/>
         </w:rPr>
-        <w:t xml:space="preserve">White-label partnerships from the operator's seat: how the margin really works, why you own every mistake, and the questions I ask before signing.  (146)</w:t>
+        <w:t xml:space="preserve">I resold voice AI for years before building Trillet. How white-label partnerships really work, where the margin goes, and what I check before I sign.  (147)</w:t>
       </w:r>
     </w:p>
     <w:p>
@@ -183,7 +183,7 @@
           <w:sz w:val="14"/>
           <w:szCs w:val="14"/>
         </w:rPr>
-        <w:t xml:space="preserve">INTERNAL LINKS   </w:t>
+        <w:t xml:space="preserve">VOICE   </w:t>
       </w:r>
       <w:r>
         <w:rPr>
@@ -194,7 +194,34 @@
           <w:sz w:val="17"/>
           <w:szCs w:val="17"/>
         </w:rPr>
-        <w:t xml:space="preserve">6 placed inline, marked [/path]. Anchor text is natural; the tag is for the publisher.</w:t>
+        <w:t xml:space="preserve">Founder who resold voice AI, hit these problems, built Trillet to fix them, and now shares how they would approach it. First person throughout.</w:t>
+      </w:r>
+    </w:p>
+    <w:p>
+      <w:pPr>
+        <w:spacing w:after="26"/>
+      </w:pPr>
+      <w:r>
+        <w:rPr>
+          <w:rFonts w:ascii="Consolas" w:cs="Consolas" w:eastAsia="Consolas" w:hAnsi="Consolas"/>
+          <w:b/>
+          <w:bCs/>
+          <w:color w:val="9A6B3F"/>
+          <w:sz w:val="14"/>
+          <w:szCs w:val="14"/>
+        </w:rPr>
+        <w:t xml:space="preserve">INTERNAL LINKS   </w:t>
+      </w:r>
+      <w:r>
+        <w:rPr>
+          <w:rFonts w:ascii="Calibri" w:cs="Calibri" w:eastAsia="Calibri" w:hAnsi="Calibri"/>
+          <w:b w:val="false"/>
+          <w:bCs w:val="false"/>
+          <w:color w:val="24303F"/>
+          <w:sz w:val="17"/>
+          <w:szCs w:val="17"/>
+        </w:rPr>
+        <w:t xml:space="preserve">4, all natural: profit-margins, built-in-compliance, /whitelabel, /partners. Dropped the two that read as forced (build-vs-buy aside, lone vertical link).</w:t>
       </w:r>
     </w:p>
     <w:p>
@@ -246,7 +273,7 @@
           <w:sz w:val="16"/>
           <w:szCs w:val="16"/>
         </w:rPr>
-        <w:t xml:space="preserve">Compliance now matches trillet.ai: SOC 2 Type II, ISO 27001, and operation under HIPAA, GDPR, ACMA, TCPA. Removed the earlier unverified “included on every plan at no extra cost” claim.</w:t>
+        <w:t xml:space="preserve">Compliance matches trillet.ai: SOC 2 Type II, ISO 27001, and operation under HIPAA, GDPR, ACMA, TCPA. No 'included on every plan at no cost' claim (site does not state it).</w:t>
       </w:r>
     </w:p>
     <w:p>
@@ -271,7 +298,7 @@
           <w:sz w:val="16"/>
           <w:szCs w:val="16"/>
         </w:rPr>
-        <w:t xml:space="preserve">Audit-trail claim verified and sharpened: the site states “full audit trails and role-based access on every client workspace,” with recordings and transcripts stored onshore.</w:t>
+        <w:t xml:space="preserve">Audit-trail claim verified: 'full audit trails and role-based access on every client workspace,' recordings and transcripts stored onshore.</w:t>
       </w:r>
     </w:p>
     <w:p>
@@ -296,7 +323,7 @@
           <w:sz w:val="16"/>
           <w:szCs w:val="16"/>
         </w:rPr>
-        <w:t xml:space="preserve">Partner structure corrected: the white-label platform (self-serve) is distinct from the three partnership tracks (reseller, referral, OEM). CTA now reflects this.</w:t>
+        <w:t xml:space="preserve">Partner structure correct: self-serve white-label platform vs the three tracks (reseller, referral, OEM).</w:t>
       </w:r>
     </w:p>
     <w:p>
@@ -321,7 +348,7 @@
           <w:sz w:val="16"/>
           <w:szCs w:val="16"/>
         </w:rPr>
-        <w:t xml:space="preserve">Real usage figure used: $0.12/min (Studio $99/mo, Agency $299/mo per the live white-label page).</w:t>
+        <w:t xml:space="preserve">Real usage figure: $0.12/min (Studio $99/mo, Agency $299/mo).</w:t>
       </w:r>
     </w:p>
     <w:p>
@@ -346,7 +373,32 @@
           <w:sz w:val="16"/>
           <w:szCs w:val="16"/>
         </w:rPr>
-        <w:t xml:space="preserve">Re-confirm pricing and certifications at publish; both can change. On-premise/data-residency is enterprise-tier; the copy does not imply it is universal.</w:t>
+        <w:t xml:space="preserve">Founder-origin framing (resold voice AI, then built Trillet) must be true of the named author. Confirm the bio and byline before publish.</w:t>
+      </w:r>
+    </w:p>
+    <w:p>
+      <w:pPr>
+        <w:spacing w:after="40"/>
+      </w:pPr>
+      <w:r>
+        <w:rPr>
+          <w:rFonts w:ascii="Calibri" w:cs="Calibri" w:eastAsia="Calibri" w:hAnsi="Calibri"/>
+          <w:b/>
+          <w:bCs/>
+          <w:color w:val="B4442E"/>
+          <w:sz w:val="16"/>
+          <w:szCs w:val="16"/>
+        </w:rPr>
+        <w:t xml:space="preserve">⚑ </w:t>
+      </w:r>
+      <w:r>
+        <w:rPr>
+          <w:rFonts w:ascii="Calibri" w:cs="Calibri" w:eastAsia="Calibri" w:hAnsi="Calibri"/>
+          <w:color w:val="5A6675"/>
+          <w:sz w:val="16"/>
+          <w:szCs w:val="16"/>
+        </w:rPr>
+        <w:t xml:space="preserve">Re-confirm pricing and certifications at publish; both can change. On-premise/data-residency is enterprise-tier, and the copy does not imply otherwise.</w:t>
       </w:r>
     </w:p>
     <w:p>
@@ -375,7 +427,7 @@
           <w:sz w:val="20"/>
           <w:szCs w:val="20"/>
         </w:rPr>
-        <w:t xml:space="preserve">I have watched white-label partnerships make an agency’s year, and I have watched them slowly sink one. The product was rarely what decided which way it went. What decided it was the unglamorous stuff nobody raises on the sales call: who answers when something breaks, whether the numbers still work after the vendor lifts its rates, and whether you can prove what your AI said when a client’s customer swears it said something else.</w:t>
+        <w:t xml:space="preserve">For years I ran an agency reselling voice AI to local businesses, and I signed the kind of white-label deals this article is about. Some of them paid the bills for years. Others taught me the lessons here the hard way. The product was rarely what decided which way a deal went. What decided it was the unglamorous stuff nobody raises on the sales call: who answers when something breaks, whether the numbers still work after the vendor lifts its rates, and whether you can prove what your AI said when a client’s customer swears it said something else. I got tired of losing that fight on other people’s platforms, so I built Trillet. Here is what I learned, and how I would approach a white-label partnership today.</w:t>
       </w:r>
     </w:p>
     <w:p>
@@ -393,7 +445,7 @@
           <w:sz w:val="20"/>
           <w:szCs w:val="20"/>
         </w:rPr>
-        <w:t xml:space="preserve">Here is the plain version before the detail. A white-label partnership means you sell someone else’s product under your own brand. The vendor builds it and keeps it running; you rebrand it, price it, sell it, and own the client. The rest of this covers what the sales page skips, because that is what decides whether the deal actually makes you money.</w:t>
+        <w:t xml:space="preserve">First the plain version, because vendors like to complicate it. A white-label partnership means you sell someone else’s product under your own brand. They build it and keep it running; you rebrand it, price it, sell it, and own the client. Everything that matters sits in what the sales page leaves out.</w:t>
       </w:r>
     </w:p>
     <w:p>
@@ -409,7 +461,7 @@
           <w:sz w:val="25"/>
           <w:szCs w:val="25"/>
         </w:rPr>
-        <w:t xml:space="preserve">The labels get blurred, so know which one you’re signing</w:t>
+        <w:t xml:space="preserve">The word “white-label” hides four different deals</w:t>
       </w:r>
     </w:p>
     <w:p>
@@ -1020,7 +1072,7 @@
           <w:sz w:val="20"/>
           <w:szCs w:val="20"/>
         </w:rPr>
-        <w:t xml:space="preserve">The pitch rarely changes: pay wholesale, charge retail, keep the difference, and it recurs every month. That part holds. Two things erode the margin, and both are avoidable once you know to look.</w:t>
+        <w:t xml:space="preserve">The pitch never changes: pay wholesale, charge retail, keep the difference, and it recurs every month. That part is real. Two things ate into my margin, and both are avoidable once you know to look.</w:t>
       </w:r>
     </w:p>
     <w:p>
@@ -1038,25 +1090,7 @@
           <w:sz w:val="20"/>
           <w:szCs w:val="20"/>
         </w:rPr>
-        <w:t xml:space="preserve">The first is pricing a usage-based cost as if it were fixed. Most AI platforms bill per minute or per interaction. Trillet’s usage runs at $0.12 a minute, for instance. If you sell a client a flat monthly price and one heavy user runs the minutes up, your margin on that account can fall to nothing before you notice. Price with a usage band rather than a flat rate you will regret later.</w:t>
-      </w:r>
-    </w:p>
-    <w:p>
-      <w:pPr>
-        <w:spacing w:after="110" w:line="278"/>
-      </w:pPr>
-      <w:r>
-        <w:rPr>
-          <w:rFonts w:ascii="Calibri" w:cs="Calibri" w:eastAsia="Calibri" w:hAnsi="Calibri"/>
-          <w:b w:val="false"/>
-          <w:bCs w:val="false"/>
-          <w:i w:val="false"/>
-          <w:iCs w:val="false"/>
-          <w:color w:val="24303F"/>
-          <w:sz w:val="20"/>
-          <w:szCs w:val="20"/>
-        </w:rPr>
-        <w:t xml:space="preserve">The second is rate creep. You lock a client’s price to win the deal, then the vendor lifts its wholesale rate or moves a feature you rely on into a higher tier, and the squeeze lands on you. I now assume wholesale pricing will move, and I ask in writing how far and how often it can. The numbers behind a healthy recurring margin are in our </w:t>
+        <w:t xml:space="preserve">The first is pricing a usage-based cost as if it were fixed. Most platforms bill per minute. If you sell a client a flat monthly price and one heavy user runs the minutes up, your margin on that account can fall to nothing before you notice. I price everything with a usage band now, and when we built Trillet we kept usage at a flat $0.12 a minute so the maths stays predictable for the agencies reselling it. The fuller numbers are in our </w:t>
       </w:r>
       <w:r>
         <w:rPr>
@@ -1088,7 +1122,95 @@
           <w:sz w:val="20"/>
           <w:szCs w:val="20"/>
         </w:rPr>
-        <w:t xml:space="preserve"> breakdown. A few agencies weigh building their own on Vapi or Retell instead of reselling; that </w:t>
+        <w:t xml:space="preserve"> breakdown.</w:t>
+      </w:r>
+    </w:p>
+    <w:p>
+      <w:pPr>
+        <w:spacing w:after="110" w:line="278"/>
+      </w:pPr>
+      <w:r>
+        <w:rPr>
+          <w:rFonts w:ascii="Calibri" w:cs="Calibri" w:eastAsia="Calibri" w:hAnsi="Calibri"/>
+          <w:b w:val="false"/>
+          <w:bCs w:val="false"/>
+          <w:i w:val="false"/>
+          <w:iCs w:val="false"/>
+          <w:color w:val="24303F"/>
+          <w:sz w:val="20"/>
+          <w:szCs w:val="20"/>
+        </w:rPr>
+        <w:t xml:space="preserve">The second is rate creep. You lock a client’s price to win the deal, then the vendor lifts its wholesale rate or moves a feature you rely on into a higher tier, and the squeeze lands on you. I lost real margin this way before I learned to assume wholesale pricing will move, and to get in writing how far and how often it can.</w:t>
+      </w:r>
+    </w:p>
+    <w:p>
+      <w:pPr>
+        <w:spacing w:after="50" w:before="150"/>
+      </w:pPr>
+      <w:r>
+        <w:rPr>
+          <w:rFonts w:ascii="Georgia" w:cs="Georgia" w:eastAsia="Georgia" w:hAnsi="Georgia"/>
+          <w:b/>
+          <w:bCs/>
+          <w:color w:val="16223C"/>
+          <w:sz w:val="25"/>
+          <w:szCs w:val="25"/>
+        </w:rPr>
+        <w:t xml:space="preserve">You own every mistake the agent makes</w:t>
+      </w:r>
+    </w:p>
+    <w:p>
+      <w:pPr>
+        <w:spacing w:after="110" w:line="278"/>
+      </w:pPr>
+      <w:r>
+        <w:rPr>
+          <w:rFonts w:ascii="Calibri" w:cs="Calibri" w:eastAsia="Calibri" w:hAnsi="Calibri"/>
+          <w:b w:val="false"/>
+          <w:bCs w:val="false"/>
+          <w:i w:val="false"/>
+          <w:iCs w:val="false"/>
+          <w:color w:val="24303F"/>
+          <w:sz w:val="20"/>
+          <w:szCs w:val="20"/>
+        </w:rPr>
+        <w:t xml:space="preserve">This is the risk people underestimate, and it is the one that pushed me to build Trillet. When the agent wears your brand, a wrong answer, an invented policy or a botched booking reads to the client’s customer as your mistake, not the vendor’s.</w:t>
+      </w:r>
+    </w:p>
+    <w:p>
+      <w:pPr>
+        <w:spacing w:after="110" w:line="278"/>
+      </w:pPr>
+      <w:r>
+        <w:rPr>
+          <w:rFonts w:ascii="Calibri" w:cs="Calibri" w:eastAsia="Calibri" w:hAnsi="Calibri"/>
+          <w:b w:val="false"/>
+          <w:bCs w:val="false"/>
+          <w:i w:val="false"/>
+          <w:iCs w:val="false"/>
+          <w:color w:val="24303F"/>
+          <w:sz w:val="20"/>
+          <w:szCs w:val="20"/>
+        </w:rPr>
+        <w:t xml:space="preserve">It was worst at the support desk. A customer would complain to my client, my client would come to me, and I would go to the vendor holding a ticket with nothing attached: no recording, no transcript, no log of what the agent said or which tool it called. I was apologising for something I could not see, while my client watched how I handled it.</w:t>
+      </w:r>
+    </w:p>
+    <w:p>
+      <w:pPr>
+        <w:spacing w:after="110" w:line="278"/>
+      </w:pPr>
+      <w:r>
+        <w:rPr>
+          <w:rFonts w:ascii="Calibri" w:cs="Calibri" w:eastAsia="Calibri" w:hAnsi="Calibri"/>
+          <w:b w:val="false"/>
+          <w:bCs w:val="false"/>
+          <w:i w:val="false"/>
+          <w:iCs w:val="false"/>
+          <w:color w:val="24303F"/>
+          <w:sz w:val="20"/>
+          <w:szCs w:val="20"/>
+        </w:rPr>
+        <w:t xml:space="preserve">That is the specific problem Trillet was built to end. Every client workspace keeps full audit trails and role-based access, and recordings and transcripts are kept, so a disputed call is something you open and read rather than guess at. We made compliance part of the platform for the same reason: SOC 2 Type II and ISO 27001, and operation under HIPAA, GDPR, ACMA and TCPA, because when your clients are clinics or law firms you cannot bolt that on afterwards. If that is the part you care about, our </w:t>
       </w:r>
       <w:r>
         <w:rPr>
@@ -1098,7 +1220,7 @@
           <w:szCs w:val="20"/>
           <w:u w:val="single"/>
         </w:rPr>
-        <w:t xml:space="preserve">build-versus-buy call</w:t>
+        <w:t xml:space="preserve">white-label AI with built-in compliance</w:t>
       </w:r>
       <w:r>
         <w:rPr>
@@ -1107,20 +1229,20 @@
           <w:sz w:val="12"/>
           <w:szCs w:val="12"/>
         </w:rPr>
-        <w:t xml:space="preserve"> [/blogs/build-on-vapi-retell-vs-buy-white-label]</w:t>
-      </w:r>
-      <w:r>
-        <w:rPr>
-          <w:rFonts w:ascii="Calibri" w:cs="Calibri" w:eastAsia="Calibri" w:hAnsi="Calibri"/>
-          <w:b w:val="false"/>
-          <w:bCs w:val="false"/>
-          <w:i w:val="false"/>
-          <w:iCs w:val="false"/>
-          <w:color w:val="24303F"/>
-          <w:sz w:val="20"/>
-          <w:szCs w:val="20"/>
-        </w:rPr>
-        <w:t xml:space="preserve"> is its own exercise.</w:t>
+        <w:t xml:space="preserve"> [/blogs/white-label-ai-with-built-in-compliance]</w:t>
+      </w:r>
+      <w:r>
+        <w:rPr>
+          <w:rFonts w:ascii="Calibri" w:cs="Calibri" w:eastAsia="Calibri" w:hAnsi="Calibri"/>
+          <w:b w:val="false"/>
+          <w:bCs w:val="false"/>
+          <w:i w:val="false"/>
+          <w:iCs w:val="false"/>
+          <w:color w:val="24303F"/>
+          <w:sz w:val="20"/>
+          <w:szCs w:val="20"/>
+        </w:rPr>
+        <w:t xml:space="preserve"> page goes deeper.</w:t>
       </w:r>
     </w:p>
     <w:p>
@@ -1136,7 +1258,7 @@
           <w:sz w:val="25"/>
           <w:szCs w:val="25"/>
         </w:rPr>
-        <w:t xml:space="preserve">You own every mistake the agent makes</w:t>
+        <w:t xml:space="preserve">How I choose a partner now</w:t>
       </w:r>
     </w:p>
     <w:p>
@@ -1154,109 +1276,7 @@
           <w:sz w:val="20"/>
           <w:szCs w:val="20"/>
         </w:rPr>
-        <w:t xml:space="preserve">This is the risk people underestimate, and the one that has cost me the most sleep. When the agent wears your brand, a wrong answer, an invented policy or a botched booking reads to the client’s customer as your company’s error rather than the vendor’s.</w:t>
-      </w:r>
-    </w:p>
-    <w:p>
-      <w:pPr>
-        <w:spacing w:after="110" w:line="278"/>
-      </w:pPr>
-      <w:r>
-        <w:rPr>
-          <w:rFonts w:ascii="Calibri" w:cs="Calibri" w:eastAsia="Calibri" w:hAnsi="Calibri"/>
-          <w:b w:val="false"/>
-          <w:bCs w:val="false"/>
-          <w:i w:val="false"/>
-          <w:iCs w:val="false"/>
-          <w:color w:val="24303F"/>
-          <w:sz w:val="20"/>
-          <w:szCs w:val="20"/>
-        </w:rPr>
-        <w:t xml:space="preserve">It is harder at the support desk. The customer complains to your client, your client comes to you, and you go to the vendor holding a ticket with none of the detail attached: no recording, no transcript, no log of what the agent said or which tool it called. You end up apologising for something you cannot see, while your client watches how you handle it.</w:t>
-      </w:r>
-    </w:p>
-    <w:p>
-      <w:pPr>
-        <w:spacing w:after="110" w:line="278"/>
-      </w:pPr>
-      <w:r>
-        <w:rPr>
-          <w:rFonts w:ascii="Calibri" w:cs="Calibri" w:eastAsia="Calibri" w:hAnsi="Calibri"/>
-          <w:b w:val="false"/>
-          <w:bCs w:val="false"/>
-          <w:i w:val="false"/>
-          <w:iCs w:val="false"/>
-          <w:color w:val="24303F"/>
-          <w:sz w:val="20"/>
-          <w:szCs w:val="20"/>
-        </w:rPr>
-        <w:t xml:space="preserve">So I treat one question as non-negotiable now: can I pull a full record of any conversation myself, on demand? If a platform cannot show me what its own agent said, I cannot stand behind my brand. This is where Trillet’s setup differs. Every client workspace carries full audit trails and role-based access, and recordings and transcripts are kept, so a disputed call is something you open rather than guess at. Compliance is built into the platform too: SOC 2 Type II and ISO 27001, and operation under HIPAA, GDPR, ACMA and TCPA, which counts for a lot when your clients are clinics or law firms. Our </w:t>
-      </w:r>
-      <w:r>
-        <w:rPr>
-          <w:rFonts w:ascii="Calibri" w:cs="Calibri" w:eastAsia="Calibri" w:hAnsi="Calibri"/>
-          <w:color w:val="1B5E86"/>
-          <w:sz w:val="20"/>
-          <w:szCs w:val="20"/>
-          <w:u w:val="single"/>
-        </w:rPr>
-        <w:t xml:space="preserve">white-label AI with built-in compliance</w:t>
-      </w:r>
-      <w:r>
-        <w:rPr>
-          <w:rFonts w:ascii="Consolas" w:cs="Consolas" w:eastAsia="Consolas" w:hAnsi="Consolas"/>
-          <w:color w:val="5A6675"/>
-          <w:sz w:val="12"/>
-          <w:szCs w:val="12"/>
-        </w:rPr>
-        <w:t xml:space="preserve"> [/blogs/white-label-ai-with-built-in-compliance]</w:t>
-      </w:r>
-      <w:r>
-        <w:rPr>
-          <w:rFonts w:ascii="Calibri" w:cs="Calibri" w:eastAsia="Calibri" w:hAnsi="Calibri"/>
-          <w:b w:val="false"/>
-          <w:bCs w:val="false"/>
-          <w:i w:val="false"/>
-          <w:iCs w:val="false"/>
-          <w:color w:val="24303F"/>
-          <w:sz w:val="20"/>
-          <w:szCs w:val="20"/>
-        </w:rPr>
-        <w:t xml:space="preserve"> page covers how that works in practice.</w:t>
-      </w:r>
-    </w:p>
-    <w:p>
-      <w:pPr>
-        <w:spacing w:after="50" w:before="150"/>
-      </w:pPr>
-      <w:r>
-        <w:rPr>
-          <w:rFonts w:ascii="Georgia" w:cs="Georgia" w:eastAsia="Georgia" w:hAnsi="Georgia"/>
-          <w:b/>
-          <w:bCs/>
-          <w:color w:val="16223C"/>
-          <w:sz w:val="25"/>
-          <w:szCs w:val="25"/>
-        </w:rPr>
-        <w:t xml:space="preserve">How I vet a partner now</w:t>
-      </w:r>
-    </w:p>
-    <w:p>
-      <w:pPr>
-        <w:spacing w:after="110" w:line="278"/>
-      </w:pPr>
-      <w:r>
-        <w:rPr>
-          <w:rFonts w:ascii="Calibri" w:cs="Calibri" w:eastAsia="Calibri" w:hAnsi="Calibri"/>
-          <w:b w:val="false"/>
-          <w:bCs w:val="false"/>
-          <w:i w:val="false"/>
-          <w:iCs w:val="false"/>
-          <w:color w:val="24303F"/>
-          <w:sz w:val="20"/>
-          <w:szCs w:val="20"/>
-        </w:rPr>
-        <w:t xml:space="preserve">After a couple of expensive lessons I stopped being swayed by the demo and started working the same list every time. The left column is what I ask. The right column is what makes me walk away.</w:t>
+        <w:t xml:space="preserve">After those lessons I stopped being swayed by the demo and started working the same list every time. The left column is what I ask. The right column is what makes me walk away.</w:t>
       </w:r>
     </w:p>
     <w:tbl>
@@ -2021,7 +2041,7 @@
           <w:sz w:val="25"/>
           <w:szCs w:val="25"/>
         </w:rPr>
-        <w:t xml:space="preserve">The clauses I won’t sign without</w:t>
+        <w:t xml:space="preserve">The contract clauses I insist on now</w:t>
       </w:r>
     </w:p>
     <w:p>
@@ -2217,7 +2237,7 @@
           <w:sz w:val="25"/>
           <w:szCs w:val="25"/>
         </w:rPr>
-        <w:t xml:space="preserve">Who this actually works for</w:t>
+        <w:t xml:space="preserve">Who white-label voice AI actually suits</w:t>
       </w:r>
     </w:p>
     <w:p>
@@ -2235,7 +2255,59 @@
           <w:sz w:val="20"/>
           <w:szCs w:val="20"/>
         </w:rPr>
-        <w:t xml:space="preserve">It does not fit everyone. White-label voice AI works best when your clients live on the phone and lose real money on a missed call: </w:t>
+        <w:t xml:space="preserve">I will not pretend it suits everyone. White-label voice AI works best when your clients live on the phone and lose real money on a missed call: legal intake, medical reception, home services, real estate. Those are also the clients who care most about compliance and a defensible record, which is where it pays off. If your clients will not pay monthly, or you cannot staff even light support, this will frustrate you, and it is better to know that before you sign.</w:t>
+      </w:r>
+    </w:p>
+    <w:p>
+      <w:pPr>
+        <w:spacing w:after="50" w:before="150"/>
+      </w:pPr>
+      <w:r>
+        <w:rPr>
+          <w:rFonts w:ascii="Georgia" w:cs="Georgia" w:eastAsia="Georgia" w:hAnsi="Georgia"/>
+          <w:b/>
+          <w:bCs/>
+          <w:color w:val="16223C"/>
+          <w:sz w:val="25"/>
+          <w:szCs w:val="25"/>
+        </w:rPr>
+        <w:t xml:space="preserve">How I’d start today</w:t>
+      </w:r>
+    </w:p>
+    <w:p>
+      <w:pPr>
+        <w:spacing w:after="110" w:line="278"/>
+      </w:pPr>
+      <w:r>
+        <w:rPr>
+          <w:rFonts w:ascii="Calibri" w:cs="Calibri" w:eastAsia="Calibri" w:hAnsi="Calibri"/>
+          <w:b w:val="false"/>
+          <w:bCs w:val="false"/>
+          <w:i w:val="false"/>
+          <w:iCs w:val="false"/>
+          <w:color w:val="24303F"/>
+          <w:sz w:val="20"/>
+          <w:szCs w:val="20"/>
+        </w:rPr>
+        <w:t xml:space="preserve">If I were starting again, I would start narrow. Pick one vertical you already understand, sign two or three clients before you touch your pricing page, and price for a margin that survives a jump in usage. Lead with the record-keeping and compliance where your clients are regulated, because that is the part most competitors gloss over.</w:t>
+      </w:r>
+    </w:p>
+    <w:p>
+      <w:pPr>
+        <w:spacing w:after="110" w:line="278"/>
+      </w:pPr>
+      <w:r>
+        <w:rPr>
+          <w:rFonts w:ascii="Calibri" w:cs="Calibri" w:eastAsia="Calibri" w:hAnsi="Calibri"/>
+          <w:b w:val="false"/>
+          <w:bCs w:val="false"/>
+          <w:i w:val="false"/>
+          <w:iCs w:val="false"/>
+          <w:color w:val="24303F"/>
+          <w:sz w:val="20"/>
+          <w:szCs w:val="20"/>
+        </w:rPr>
+        <w:t xml:space="preserve">When you compare platforms, the way we built Trillet splits into two paths. The </w:t>
       </w:r>
       <w:r>
         <w:rPr>
@@ -2245,7 +2317,7 @@
           <w:szCs w:val="20"/>
           <w:u w:val="single"/>
         </w:rPr>
-        <w:t xml:space="preserve">legal intake</w:t>
+        <w:t xml:space="preserve">white-label platform</w:t>
       </w:r>
       <w:r>
         <w:rPr>
@@ -2254,20 +2326,20 @@
           <w:sz w:val="12"/>
           <w:szCs w:val="12"/>
         </w:rPr>
-        <w:t xml:space="preserve"> [/blogs/ai-receptionist-for-law-firms-white-label]</w:t>
-      </w:r>
-      <w:r>
-        <w:rPr>
-          <w:rFonts w:ascii="Calibri" w:cs="Calibri" w:eastAsia="Calibri" w:hAnsi="Calibri"/>
-          <w:b w:val="false"/>
-          <w:bCs w:val="false"/>
-          <w:i w:val="false"/>
-          <w:iCs w:val="false"/>
-          <w:color w:val="24303F"/>
-          <w:sz w:val="20"/>
-          <w:szCs w:val="20"/>
-        </w:rPr>
-        <w:t xml:space="preserve">, medical reception, home services, real estate. Those are also the clients who care most about compliance and a defensible record, which is where a serious platform pays for itself. If your clients will not pay monthly, or you cannot staff even light support, the model will frustrate you. Where it fits, Trillet’s </w:t>
+        <w:t xml:space="preserve"> [/whitelabel]</w:t>
+      </w:r>
+      <w:r>
+        <w:rPr>
+          <w:rFonts w:ascii="Calibri" w:cs="Calibri" w:eastAsia="Calibri" w:hAnsi="Calibri"/>
+          <w:b w:val="false"/>
+          <w:bCs w:val="false"/>
+          <w:i w:val="false"/>
+          <w:iCs w:val="false"/>
+          <w:color w:val="24303F"/>
+          <w:sz w:val="20"/>
+          <w:szCs w:val="20"/>
+        </w:rPr>
+        <w:t xml:space="preserve"> is self-serve for agencies building under their own brand. The reseller, referral and OEM tracks in the </w:t>
       </w:r>
       <w:r>
         <w:rPr>
@@ -2277,7 +2349,7 @@
           <w:szCs w:val="20"/>
           <w:u w:val="single"/>
         </w:rPr>
-        <w:t xml:space="preserve">white-label voice AI platform</w:t>
+        <w:t xml:space="preserve">partner program</w:t>
       </w:r>
       <w:r>
         <w:rPr>
@@ -2286,90 +2358,6 @@
           <w:sz w:val="12"/>
           <w:szCs w:val="12"/>
         </w:rPr>
-        <w:t xml:space="preserve"> [/whitelabel]</w:t>
-      </w:r>
-      <w:r>
-        <w:rPr>
-          <w:rFonts w:ascii="Calibri" w:cs="Calibri" w:eastAsia="Calibri" w:hAnsi="Calibri"/>
-          <w:b w:val="false"/>
-          <w:bCs w:val="false"/>
-          <w:i w:val="false"/>
-          <w:iCs w:val="false"/>
-          <w:color w:val="24303F"/>
-          <w:sz w:val="20"/>
-          <w:szCs w:val="20"/>
-        </w:rPr>
-        <w:t xml:space="preserve"> is built for these resale motions, and the compliance that protects a law firm’s intake is the same compliance protecting your brand when you resell it.</w:t>
-      </w:r>
-    </w:p>
-    <w:p>
-      <w:pPr>
-        <w:spacing w:after="50" w:before="150"/>
-      </w:pPr>
-      <w:r>
-        <w:rPr>
-          <w:rFonts w:ascii="Georgia" w:cs="Georgia" w:eastAsia="Georgia" w:hAnsi="Georgia"/>
-          <w:b/>
-          <w:bCs/>
-          <w:color w:val="16223C"/>
-          <w:sz w:val="25"/>
-          <w:szCs w:val="25"/>
-        </w:rPr>
-        <w:t xml:space="preserve">If you’re starting now</w:t>
-      </w:r>
-    </w:p>
-    <w:p>
-      <w:pPr>
-        <w:spacing w:after="110" w:line="278"/>
-      </w:pPr>
-      <w:r>
-        <w:rPr>
-          <w:rFonts w:ascii="Calibri" w:cs="Calibri" w:eastAsia="Calibri" w:hAnsi="Calibri"/>
-          <w:b w:val="false"/>
-          <w:bCs w:val="false"/>
-          <w:i w:val="false"/>
-          <w:iCs w:val="false"/>
-          <w:color w:val="24303F"/>
-          <w:sz w:val="20"/>
-          <w:szCs w:val="20"/>
-        </w:rPr>
-        <w:t xml:space="preserve">Start narrow. Pick one vertical you already understand, sign two or three clients before you touch your pricing page, and price for a margin that survives a jump in usage. Lead with the record-keeping and compliance where your clients are regulated, since that is the part most competitors gloss over. Keep onboarding tight and repeatable.</w:t>
-      </w:r>
-    </w:p>
-    <w:p>
-      <w:pPr>
-        <w:spacing w:after="110" w:line="278"/>
-      </w:pPr>
-      <w:r>
-        <w:rPr>
-          <w:rFonts w:ascii="Calibri" w:cs="Calibri" w:eastAsia="Calibri" w:hAnsi="Calibri"/>
-          <w:b w:val="false"/>
-          <w:bCs w:val="false"/>
-          <w:i w:val="false"/>
-          <w:iCs w:val="false"/>
-          <w:color w:val="24303F"/>
-          <w:sz w:val="20"/>
-          <w:szCs w:val="20"/>
-        </w:rPr>
-        <w:t xml:space="preserve">When you compare platforms, note how Trillet splits the two paths. The white-label platform is self-serve for agencies building under their own brand. The reseller, referral and OEM tracks are formal partnerships with terms set around your volume. Match the path to how hands-on you want to be: the </w:t>
-      </w:r>
-      <w:r>
-        <w:rPr>
-          <w:rFonts w:ascii="Calibri" w:cs="Calibri" w:eastAsia="Calibri" w:hAnsi="Calibri"/>
-          <w:color w:val="1B5E86"/>
-          <w:sz w:val="20"/>
-          <w:szCs w:val="20"/>
-          <w:u w:val="single"/>
-        </w:rPr>
-        <w:t xml:space="preserve">partner program</w:t>
-      </w:r>
-      <w:r>
-        <w:rPr>
-          <w:rFonts w:ascii="Consolas" w:cs="Consolas" w:eastAsia="Consolas" w:hAnsi="Consolas"/>
-          <w:color w:val="5A6675"/>
-          <w:sz w:val="12"/>
-          <w:szCs w:val="12"/>
-        </w:rPr>
         <w:t xml:space="preserve"> [/partners]</w:t>
       </w:r>
       <w:r>
@@ -2383,39 +2371,7 @@
           <w:sz w:val="20"/>
           <w:szCs w:val="20"/>
         </w:rPr>
-        <w:t xml:space="preserve"> lays out the three tracks, and the </w:t>
-      </w:r>
-      <w:r>
-        <w:rPr>
-          <w:rFonts w:ascii="Calibri" w:cs="Calibri" w:eastAsia="Calibri" w:hAnsi="Calibri"/>
-          <w:color w:val="1B5E86"/>
-          <w:sz w:val="20"/>
-          <w:szCs w:val="20"/>
-          <w:u w:val="single"/>
-        </w:rPr>
-        <w:t xml:space="preserve">white-label platform</w:t>
-      </w:r>
-      <w:r>
-        <w:rPr>
-          <w:rFonts w:ascii="Consolas" w:cs="Consolas" w:eastAsia="Consolas" w:hAnsi="Consolas"/>
-          <w:color w:val="5A6675"/>
-          <w:sz w:val="12"/>
-          <w:szCs w:val="12"/>
-        </w:rPr>
-        <w:t xml:space="preserve"> [/whitelabel]</w:t>
-      </w:r>
-      <w:r>
-        <w:rPr>
-          <w:rFonts w:ascii="Calibri" w:cs="Calibri" w:eastAsia="Calibri" w:hAnsi="Calibri"/>
-          <w:b w:val="false"/>
-          <w:bCs w:val="false"/>
-          <w:i w:val="false"/>
-          <w:iCs w:val="false"/>
-          <w:color w:val="24303F"/>
-          <w:sz w:val="20"/>
-          <w:szCs w:val="20"/>
-        </w:rPr>
-        <w:t xml:space="preserve"> is the route if you would rather build and brand it yourself.</w:t>
+        <w:t xml:space="preserve"> are formal arrangements with terms set around your volume. Pick the path that matches how hands-on you want to be.</w:t>
       </w:r>
     </w:p>
     <w:p>
@@ -2680,7 +2636,7 @@
           <w:sz w:val="17"/>
           <w:szCs w:val="17"/>
         </w:rPr>
-        <w:t xml:space="preserve">Article + FAQPage + BreadcrumbList. FAQ answers must match the on-page FAQ verbatim; author must be a real person.</w:t>
+        <w:t xml:space="preserve">Article + FAQPage + BreadcrumbList. FAQ answers must match the on-page FAQ verbatim; author must be the real founder/byline.</w:t>
       </w:r>
     </w:p>
     <w:tbl>
@@ -2783,7 +2739,7 @@
                 <w:sz w:val="13"/>
                 <w:szCs w:val="13"/>
               </w:rPr>
-              <w:t xml:space="preserve">    "author":{"@type":"Person","name":"&lt;real author&gt;","jobTitle":"&lt;role&gt;"},</w:t>
+              <w:t xml:space="preserve">    "author":{"@type":"Person","name":"&lt;real founder&gt;","jobTitle":"Founder, Trillet"},</w:t>
             </w:r>
           </w:p>
           <w:p>

</xml_diff>